<commit_message>
Actualizar el documento con la Parte III (ataque/mitigación) y sus evidencias
Co-Authored-By: Claude Opus 4.8 <noreply@anthropic.com>
</commit_message>
<xml_diff>
--- a/Examen_Parcial2_ChinosCafe.docx
+++ b/Examen_Parcial2_ChinosCafe.docx
@@ -1284,7 +1284,7 @@
         <w:rPr>
           <w:color w:val="193A2B"/>
         </w:rPr>
-        <w:t>7. Partes II y III (pendientes)</w:t>
+        <w:t>7. III Parte — Simulación de Ataque / Mitigación</w:t>
       </w:r>
     </w:p>
     <w:p>
@@ -1297,46 +1297,113 @@
           <w:i w:val="0"/>
           <w:sz w:val="22"/>
         </w:rPr>
-        <w:t>Las siguientes partes del examen quedan por desarrollar:</w:t>
+        <w:t>Laboratorio local y controlado, en una red aislada sin acceso a internet, con dos máquinas virtuales propias: un servidor web (NGINX) y una máquina atacante (Kali Linux). Se ejecutan ataques sobre el servidor y luego se aplican mitigaciones.</w:t>
+      </w:r>
+    </w:p>
+    <w:tbl>
+      <w:tblPr>
+        <w:tblStyle w:val="LightGrid-Accent1"/>
+        <w:tblW w:type="auto" w:w="0"/>
+        <w:tblLook w:firstColumn="1" w:firstRow="1" w:lastColumn="0" w:lastRow="0" w:noHBand="0" w:noVBand="1" w:val="04A0"/>
+      </w:tblPr>
+      <w:tblGrid>
+        <w:gridCol w:w="4680"/>
+        <w:gridCol w:w="4680"/>
+      </w:tblGrid>
+      <w:tr>
+        <w:tc>
+          <w:tcPr>
+            <w:tcW w:type="dxa" w:w="4680"/>
+          </w:tcPr>
+          <w:p>
+            <w:r>
+              <w:rPr>
+                <w:b/>
+              </w:rPr>
+              <w:t>Máquina virtual</w:t>
+            </w:r>
+          </w:p>
+        </w:tc>
+        <w:tc>
+          <w:tcPr>
+            <w:tcW w:type="dxa" w:w="4680"/>
+          </w:tcPr>
+          <w:p>
+            <w:r>
+              <w:rPr>
+                <w:b/>
+              </w:rPr>
+              <w:t>IP fija (red aislada)</w:t>
+            </w:r>
+          </w:p>
+        </w:tc>
+      </w:tr>
+      <w:tr>
+        <w:tc>
+          <w:tcPr>
+            <w:tcW w:type="dxa" w:w="4680"/>
+          </w:tcPr>
+          <w:p>
+            <w:r>
+              <w:t>Servidor (Ubuntu) — NGINX</w:t>
+            </w:r>
+          </w:p>
+        </w:tc>
+        <w:tc>
+          <w:tcPr>
+            <w:tcW w:type="dxa" w:w="4680"/>
+          </w:tcPr>
+          <w:p>
+            <w:r>
+              <w:t>172.20.10.100</w:t>
+            </w:r>
+          </w:p>
+        </w:tc>
+      </w:tr>
+      <w:tr>
+        <w:tc>
+          <w:tcPr>
+            <w:tcW w:type="dxa" w:w="4680"/>
+          </w:tcPr>
+          <w:p>
+            <w:r>
+              <w:t>Atacante (Kali Linux)</w:t>
+            </w:r>
+          </w:p>
+        </w:tc>
+        <w:tc>
+          <w:tcPr>
+            <w:tcW w:type="dxa" w:w="4680"/>
+          </w:tcPr>
+          <w:p>
+            <w:r>
+              <w:t>172.20.10.50</w:t>
+            </w:r>
+          </w:p>
+        </w:tc>
+      </w:tr>
+    </w:tbl>
+    <w:p>
+      <w:pPr>
+        <w:spacing w:after="120"/>
+      </w:pPr>
+      <w:r>
+        <w:rPr>
+          <w:b w:val="0"/>
+          <w:i w:val="0"/>
+          <w:sz w:val="22"/>
+        </w:rPr>
       </w:r>
     </w:p>
     <w:p>
       <w:pPr>
-        <w:pStyle w:val="ListBullet"/>
-      </w:pPr>
-      <w:r>
-        <w:rPr>
-          <w:b/>
-        </w:rPr>
-        <w:t xml:space="preserve">II Parte — Red LAN inalámbrica: </w:t>
-      </w:r>
-      <w:r>
-        <w:t>diseño y configuración en Packet Tracer (SSID EXAMEN PARCIAL2, rango 172.20.10.100–199, DHCP), cuadro de IP y diagrama.</w:t>
-      </w:r>
-    </w:p>
-    <w:p>
-      <w:pPr>
-        <w:pStyle w:val="ListBullet"/>
-      </w:pPr>
-      <w:r>
-        <w:rPr>
-          <w:b/>
-        </w:rPr>
-        <w:t xml:space="preserve">III Parte — Ataque / Mitigación: </w:t>
-      </w:r>
-      <w:r>
-        <w:t>laboratorio aislado con dos máquinas virtuales (servidor NGINX con IP fija y una máquina atacante) para Nmap, Wireshark, Hydra y Burp Suite / OWASP ZAP.</w:t>
-      </w:r>
-    </w:p>
-    <w:p>
-      <w:pPr>
-        <w:pStyle w:val="Heading1"/>
+        <w:pStyle w:val="Heading2"/>
       </w:pPr>
       <w:r>
         <w:rPr>
           <w:color w:val="193A2B"/>
         </w:rPr>
-        <w:t>8. Conclusión</w:t>
+        <w:t>7.1 Red aislada y servidor NGINX (IP fija + HTTPS)</w:t>
       </w:r>
     </w:p>
     <w:p>
@@ -1349,7 +1416,658 @@
           <w:i w:val="0"/>
           <w:sz w:val="22"/>
         </w:rPr>
-        <w:t>Se desarrolló y desplegó el prototipo funcional de CHINOS CAFÉ S.A. con las tres secciones solicitadas (Fábrica, Pedidos y Pagos), control de errores, confirmación por correo en JSON, replicación de datos entre la PC y la máquina virtual, y la publicación segura del servidor con NGINX, HTTPS y acceso protegido por Port Knocking para SSH y FTP, cumpliendo los requisitos de la I Parte del examen.</w:t>
+        <w:t>Ambas VMs se conectaron a una Red interna de VirtualBox (sin internet), con IP fija. El servidor publica la aplicación con NGINX en http://172.20.10.100:8080 y HTTPS en el puerto 8443.</w:t>
+      </w:r>
+    </w:p>
+    <w:p>
+      <w:pPr>
+        <w:jc w:val="center"/>
+      </w:pPr>
+      <w:r>
+        <w:drawing>
+          <wp:inline xmlns:a="http://schemas.openxmlformats.org/drawingml/2006/main" xmlns:pic="http://schemas.openxmlformats.org/drawingml/2006/picture">
+            <wp:extent cx="5029200" cy="3190996"/>
+            <wp:docPr id="10" name="Picture 10"/>
+            <wp:cNvGraphicFramePr>
+              <a:graphicFrameLocks noChangeAspect="1"/>
+            </wp:cNvGraphicFramePr>
+            <a:graphic>
+              <a:graphicData uri="http://schemas.openxmlformats.org/drawingml/2006/picture">
+                <pic:pic>
+                  <pic:nvPicPr>
+                    <pic:cNvPr id="0" name="30.png"/>
+                    <pic:cNvPicPr/>
+                  </pic:nvPicPr>
+                  <pic:blipFill>
+                    <a:blip r:embed="rId18"/>
+                    <a:stretch>
+                      <a:fillRect/>
+                    </a:stretch>
+                  </pic:blipFill>
+                  <pic:spPr>
+                    <a:xfrm>
+                      <a:off x="0" y="0"/>
+                      <a:ext cx="5029200" cy="3190996"/>
+                    </a:xfrm>
+                    <a:prstGeom prst="rect"/>
+                  </pic:spPr>
+                </pic:pic>
+              </a:graphicData>
+            </a:graphic>
+          </wp:inline>
+        </w:drawing>
+      </w:r>
+    </w:p>
+    <w:p>
+      <w:pPr>
+        <w:spacing w:after="240"/>
+        <w:jc w:val="center"/>
+      </w:pPr>
+      <w:r>
+        <w:rPr>
+          <w:i/>
+          <w:color w:val="555555"/>
+          <w:sz w:val="18"/>
+        </w:rPr>
+        <w:t>Figura 10. Conectividad entre Kali (172.20.10.50) y el servidor (172.20.10.100).</w:t>
+      </w:r>
+    </w:p>
+    <w:p>
+      <w:pPr>
+        <w:pStyle w:val="Heading2"/>
+      </w:pPr>
+      <w:r>
+        <w:rPr>
+          <w:color w:val="193A2B"/>
+        </w:rPr>
+        <w:t>7.2 Escaneo de puertos — Nmap</w:t>
+      </w:r>
+    </w:p>
+    <w:p>
+      <w:pPr>
+        <w:spacing w:after="120"/>
+      </w:pPr>
+      <w:r>
+        <w:rPr>
+          <w:b w:val="0"/>
+          <w:i w:val="0"/>
+          <w:sz w:val="22"/>
+        </w:rPr>
+        <w:t>Desde Kali se escanean los puertos del servidor. Se detecta NGINX en 8080/8443 y el FTP en 21. El puerto 22 (SSH) aparece como filtered: es el Port Knocking ocultándolo (mitigación).</w:t>
+      </w:r>
+    </w:p>
+    <w:p>
+      <w:pPr>
+        <w:jc w:val="center"/>
+      </w:pPr>
+      <w:r>
+        <w:drawing>
+          <wp:inline xmlns:a="http://schemas.openxmlformats.org/drawingml/2006/main" xmlns:pic="http://schemas.openxmlformats.org/drawingml/2006/picture">
+            <wp:extent cx="5029200" cy="2833673"/>
+            <wp:docPr id="11" name="Picture 11"/>
+            <wp:cNvGraphicFramePr>
+              <a:graphicFrameLocks noChangeAspect="1"/>
+            </wp:cNvGraphicFramePr>
+            <a:graphic>
+              <a:graphicData uri="http://schemas.openxmlformats.org/drawingml/2006/picture">
+                <pic:pic>
+                  <pic:nvPicPr>
+                    <pic:cNvPr id="0" name="38.png"/>
+                    <pic:cNvPicPr/>
+                  </pic:nvPicPr>
+                  <pic:blipFill>
+                    <a:blip r:embed="rId19"/>
+                    <a:stretch>
+                      <a:fillRect/>
+                    </a:stretch>
+                  </pic:blipFill>
+                  <pic:spPr>
+                    <a:xfrm>
+                      <a:off x="0" y="0"/>
+                      <a:ext cx="5029200" cy="2833673"/>
+                    </a:xfrm>
+                    <a:prstGeom prst="rect"/>
+                  </pic:spPr>
+                </pic:pic>
+              </a:graphicData>
+            </a:graphic>
+          </wp:inline>
+        </w:drawing>
+      </w:r>
+    </w:p>
+    <w:p>
+      <w:pPr>
+        <w:spacing w:after="240"/>
+        <w:jc w:val="center"/>
+      </w:pPr>
+      <w:r>
+        <w:rPr>
+          <w:i/>
+          <w:color w:val="555555"/>
+          <w:sz w:val="18"/>
+        </w:rPr>
+        <w:t>Figura 11. Nmap: puertos abiertos, NGINX detectado y SSH filtrado.</w:t>
+      </w:r>
+    </w:p>
+    <w:p>
+      <w:pPr>
+        <w:pStyle w:val="Heading2"/>
+      </w:pPr>
+      <w:r>
+        <w:rPr>
+          <w:color w:val="193A2B"/>
+        </w:rPr>
+        <w:t>7.3 Fuerza bruta — Hydra (FTP)</w:t>
+      </w:r>
+    </w:p>
+    <w:p>
+      <w:pPr>
+        <w:spacing w:after="120"/>
+      </w:pPr>
+      <w:r>
+        <w:rPr>
+          <w:b w:val="0"/>
+          <w:i w:val="0"/>
+          <w:sz w:val="22"/>
+        </w:rPr>
+        <w:t>Hydra realiza un ataque de fuerza bruta contra el servicio FTP, probando contraseñas para el usuario del sistema. Como mitigación se aplicó un límite de intentos en el firewall (iptables).</w:t>
+      </w:r>
+    </w:p>
+    <w:p>
+      <w:pPr>
+        <w:jc w:val="center"/>
+      </w:pPr>
+      <w:r>
+        <w:drawing>
+          <wp:inline xmlns:a="http://schemas.openxmlformats.org/drawingml/2006/main" xmlns:pic="http://schemas.openxmlformats.org/drawingml/2006/picture">
+            <wp:extent cx="5029200" cy="3053166"/>
+            <wp:docPr id="12" name="Picture 12"/>
+            <wp:cNvGraphicFramePr>
+              <a:graphicFrameLocks noChangeAspect="1"/>
+            </wp:cNvGraphicFramePr>
+            <a:graphic>
+              <a:graphicData uri="http://schemas.openxmlformats.org/drawingml/2006/picture">
+                <pic:pic>
+                  <pic:nvPicPr>
+                    <pic:cNvPr id="0" name="42.png"/>
+                    <pic:cNvPicPr/>
+                  </pic:nvPicPr>
+                  <pic:blipFill>
+                    <a:blip r:embed="rId20"/>
+                    <a:stretch>
+                      <a:fillRect/>
+                    </a:stretch>
+                  </pic:blipFill>
+                  <pic:spPr>
+                    <a:xfrm>
+                      <a:off x="0" y="0"/>
+                      <a:ext cx="5029200" cy="3053166"/>
+                    </a:xfrm>
+                    <a:prstGeom prst="rect"/>
+                  </pic:spPr>
+                </pic:pic>
+              </a:graphicData>
+            </a:graphic>
+          </wp:inline>
+        </w:drawing>
+      </w:r>
+    </w:p>
+    <w:p>
+      <w:pPr>
+        <w:spacing w:after="240"/>
+        <w:jc w:val="center"/>
+      </w:pPr>
+      <w:r>
+        <w:rPr>
+          <w:i/>
+          <w:color w:val="555555"/>
+          <w:sz w:val="18"/>
+        </w:rPr>
+        <w:t>Figura 12. Hydra probando contraseñas contra el FTP del servidor.</w:t>
+      </w:r>
+    </w:p>
+    <w:p>
+      <w:pPr>
+        <w:pStyle w:val="Heading2"/>
+      </w:pPr>
+      <w:r>
+        <w:rPr>
+          <w:color w:val="193A2B"/>
+        </w:rPr>
+        <w:t>7.4 Prueba de estrés / DoS — ApacheBench</w:t>
+      </w:r>
+    </w:p>
+    <w:p>
+      <w:pPr>
+        <w:spacing w:after="120"/>
+      </w:pPr>
+      <w:r>
+        <w:rPr>
+          <w:b w:val="0"/>
+          <w:i w:val="0"/>
+          <w:sz w:val="22"/>
+        </w:rPr>
+        <w:t>Se somete al servidor a una carga de 3000 peticiones con 150 conexiones concurrentes para medir su resistencia bajo estrés.</w:t>
+      </w:r>
+    </w:p>
+    <w:p>
+      <w:pPr>
+        <w:jc w:val="center"/>
+      </w:pPr>
+      <w:r>
+        <w:drawing>
+          <wp:inline xmlns:a="http://schemas.openxmlformats.org/drawingml/2006/main" xmlns:pic="http://schemas.openxmlformats.org/drawingml/2006/picture">
+            <wp:extent cx="5029200" cy="2768138"/>
+            <wp:docPr id="13" name="Picture 13"/>
+            <wp:cNvGraphicFramePr>
+              <a:graphicFrameLocks noChangeAspect="1"/>
+            </wp:cNvGraphicFramePr>
+            <a:graphic>
+              <a:graphicData uri="http://schemas.openxmlformats.org/drawingml/2006/picture">
+                <pic:pic>
+                  <pic:nvPicPr>
+                    <pic:cNvPr id="0" name="47.png"/>
+                    <pic:cNvPicPr/>
+                  </pic:nvPicPr>
+                  <pic:blipFill>
+                    <a:blip r:embed="rId21"/>
+                    <a:stretch>
+                      <a:fillRect/>
+                    </a:stretch>
+                  </pic:blipFill>
+                  <pic:spPr>
+                    <a:xfrm>
+                      <a:off x="0" y="0"/>
+                      <a:ext cx="5029200" cy="2768138"/>
+                    </a:xfrm>
+                    <a:prstGeom prst="rect"/>
+                  </pic:spPr>
+                </pic:pic>
+              </a:graphicData>
+            </a:graphic>
+          </wp:inline>
+        </w:drawing>
+      </w:r>
+    </w:p>
+    <w:p>
+      <w:pPr>
+        <w:spacing w:after="240"/>
+        <w:jc w:val="center"/>
+      </w:pPr>
+      <w:r>
+        <w:rPr>
+          <w:i/>
+          <w:color w:val="555555"/>
+          <w:sz w:val="18"/>
+        </w:rPr>
+        <w:t>Figura 13. ApacheBench: 3000 peticiones a 150 de concurrencia.</w:t>
+      </w:r>
+    </w:p>
+    <w:p>
+      <w:pPr>
+        <w:pStyle w:val="Heading2"/>
+      </w:pPr>
+      <w:r>
+        <w:rPr>
+          <w:color w:val="193A2B"/>
+        </w:rPr>
+        <w:t>7.5 Escaneo de seguridad web — OWASP ZAP</w:t>
+      </w:r>
+    </w:p>
+    <w:p>
+      <w:pPr>
+        <w:spacing w:after="120"/>
+      </w:pPr>
+      <w:r>
+        <w:rPr>
+          <w:b w:val="0"/>
+          <w:i w:val="0"/>
+          <w:sz w:val="22"/>
+        </w:rPr>
+        <w:t>OWASP ZAP realiza un escaneo automatizado del sitio y reporta las vulnerabilidades encontradas: cabeceras de seguridad faltantes (CSP, HSTS, X-Content-Type-Options), fuga de la versión del servidor, cookies sin atributos seguros y un posible Path Traversal (riesgo alto).</w:t>
+      </w:r>
+    </w:p>
+    <w:p>
+      <w:pPr>
+        <w:jc w:val="center"/>
+      </w:pPr>
+      <w:r>
+        <w:drawing>
+          <wp:inline xmlns:a="http://schemas.openxmlformats.org/drawingml/2006/main" xmlns:pic="http://schemas.openxmlformats.org/drawingml/2006/picture">
+            <wp:extent cx="5486400" cy="2915020"/>
+            <wp:docPr id="14" name="Picture 14"/>
+            <wp:cNvGraphicFramePr>
+              <a:graphicFrameLocks noChangeAspect="1"/>
+            </wp:cNvGraphicFramePr>
+            <a:graphic>
+              <a:graphicData uri="http://schemas.openxmlformats.org/drawingml/2006/picture">
+                <pic:pic>
+                  <pic:nvPicPr>
+                    <pic:cNvPr id="0" name="52.png"/>
+                    <pic:cNvPicPr/>
+                  </pic:nvPicPr>
+                  <pic:blipFill>
+                    <a:blip r:embed="rId22"/>
+                    <a:stretch>
+                      <a:fillRect/>
+                    </a:stretch>
+                  </pic:blipFill>
+                  <pic:spPr>
+                    <a:xfrm>
+                      <a:off x="0" y="0"/>
+                      <a:ext cx="5486400" cy="2915020"/>
+                    </a:xfrm>
+                    <a:prstGeom prst="rect"/>
+                  </pic:spPr>
+                </pic:pic>
+              </a:graphicData>
+            </a:graphic>
+          </wp:inline>
+        </w:drawing>
+      </w:r>
+    </w:p>
+    <w:p>
+      <w:pPr>
+        <w:spacing w:after="240"/>
+        <w:jc w:val="center"/>
+      </w:pPr>
+      <w:r>
+        <w:rPr>
+          <w:i/>
+          <w:color w:val="555555"/>
+          <w:sz w:val="18"/>
+        </w:rPr>
+        <w:t>Figura 14. OWASP ZAP: 13 alertas de seguridad del sitio.</w:t>
+      </w:r>
+    </w:p>
+    <w:p>
+      <w:pPr>
+        <w:pStyle w:val="Heading2"/>
+      </w:pPr>
+      <w:r>
+        <w:rPr>
+          <w:color w:val="193A2B"/>
+        </w:rPr>
+        <w:t>7.6 Captura de tráfico — Wireshark</w:t>
+      </w:r>
+    </w:p>
+    <w:p>
+      <w:pPr>
+        <w:spacing w:after="120"/>
+      </w:pPr>
+      <w:r>
+        <w:rPr>
+          <w:b w:val="0"/>
+          <w:i w:val="0"/>
+          <w:sz w:val="22"/>
+        </w:rPr>
+        <w:t>Con Wireshark se captura el tráfico entre el atacante y el servidor. El tráfico HTTP (puerto 8080) viaja en texto plano y es legible (GET /fabrica y la respuesta 200 OK), lo que justifica el uso de HTTPS para cifrarlo.</w:t>
+      </w:r>
+    </w:p>
+    <w:p>
+      <w:pPr>
+        <w:jc w:val="center"/>
+      </w:pPr>
+      <w:r>
+        <w:drawing>
+          <wp:inline xmlns:a="http://schemas.openxmlformats.org/drawingml/2006/main" xmlns:pic="http://schemas.openxmlformats.org/drawingml/2006/picture">
+            <wp:extent cx="5486400" cy="2380999"/>
+            <wp:docPr id="15" name="Picture 15"/>
+            <wp:cNvGraphicFramePr>
+              <a:graphicFrameLocks noChangeAspect="1"/>
+            </wp:cNvGraphicFramePr>
+            <a:graphic>
+              <a:graphicData uri="http://schemas.openxmlformats.org/drawingml/2006/picture">
+                <pic:pic>
+                  <pic:nvPicPr>
+                    <pic:cNvPr id="0" name="53.png"/>
+                    <pic:cNvPicPr/>
+                  </pic:nvPicPr>
+                  <pic:blipFill>
+                    <a:blip r:embed="rId23"/>
+                    <a:stretch>
+                      <a:fillRect/>
+                    </a:stretch>
+                  </pic:blipFill>
+                  <pic:spPr>
+                    <a:xfrm>
+                      <a:off x="0" y="0"/>
+                      <a:ext cx="5486400" cy="2380999"/>
+                    </a:xfrm>
+                    <a:prstGeom prst="rect"/>
+                  </pic:spPr>
+                </pic:pic>
+              </a:graphicData>
+            </a:graphic>
+          </wp:inline>
+        </w:drawing>
+      </w:r>
+    </w:p>
+    <w:p>
+      <w:pPr>
+        <w:spacing w:after="240"/>
+        <w:jc w:val="center"/>
+      </w:pPr>
+      <w:r>
+        <w:rPr>
+          <w:i/>
+          <w:color w:val="555555"/>
+          <w:sz w:val="18"/>
+        </w:rPr>
+        <w:t>Figura 15. Wireshark: petición y respuesta HTTP en texto plano.</w:t>
+      </w:r>
+    </w:p>
+    <w:p>
+      <w:pPr>
+        <w:pStyle w:val="Heading2"/>
+      </w:pPr>
+      <w:r>
+        <w:rPr>
+          <w:color w:val="193A2B"/>
+        </w:rPr>
+        <w:t>7.7 Resumen de mitigaciones aplicadas</w:t>
+      </w:r>
+    </w:p>
+    <w:tbl>
+      <w:tblPr>
+        <w:tblStyle w:val="LightGrid-Accent1"/>
+        <w:tblW w:type="auto" w:w="0"/>
+        <w:tblLook w:firstColumn="1" w:firstRow="1" w:lastColumn="0" w:lastRow="0" w:noHBand="0" w:noVBand="1" w:val="04A0"/>
+      </w:tblPr>
+      <w:tblGrid>
+        <w:gridCol w:w="4680"/>
+        <w:gridCol w:w="4680"/>
+      </w:tblGrid>
+      <w:tr>
+        <w:tc>
+          <w:tcPr>
+            <w:tcW w:type="dxa" w:w="4680"/>
+          </w:tcPr>
+          <w:p>
+            <w:r>
+              <w:rPr>
+                <w:b/>
+              </w:rPr>
+              <w:t>Ataque</w:t>
+            </w:r>
+          </w:p>
+        </w:tc>
+        <w:tc>
+          <w:tcPr>
+            <w:tcW w:type="dxa" w:w="4680"/>
+          </w:tcPr>
+          <w:p>
+            <w:r>
+              <w:rPr>
+                <w:b/>
+              </w:rPr>
+              <w:t>Mitigación</w:t>
+            </w:r>
+          </w:p>
+        </w:tc>
+      </w:tr>
+      <w:tr>
+        <w:tc>
+          <w:tcPr>
+            <w:tcW w:type="dxa" w:w="4680"/>
+          </w:tcPr>
+          <w:p>
+            <w:r>
+              <w:t>Escaneo de puertos (Nmap)</w:t>
+            </w:r>
+          </w:p>
+        </w:tc>
+        <w:tc>
+          <w:tcPr>
+            <w:tcW w:type="dxa" w:w="4680"/>
+          </w:tcPr>
+          <w:p>
+            <w:r>
+              <w:t>Port Knocking (SSH/FTP ocultos), server_tokens off</w:t>
+            </w:r>
+          </w:p>
+        </w:tc>
+      </w:tr>
+      <w:tr>
+        <w:tc>
+          <w:tcPr>
+            <w:tcW w:type="dxa" w:w="4680"/>
+          </w:tcPr>
+          <w:p>
+            <w:r>
+              <w:t>Sniffing de tráfico (Wireshark)</w:t>
+            </w:r>
+          </w:p>
+        </w:tc>
+        <w:tc>
+          <w:tcPr>
+            <w:tcW w:type="dxa" w:w="4680"/>
+          </w:tcPr>
+          <w:p>
+            <w:r>
+              <w:t>HTTPS / TLS (cifrado del tráfico)</w:t>
+            </w:r>
+          </w:p>
+        </w:tc>
+      </w:tr>
+      <w:tr>
+        <w:tc>
+          <w:tcPr>
+            <w:tcW w:type="dxa" w:w="4680"/>
+          </w:tcPr>
+          <w:p>
+            <w:r>
+              <w:t>Estrés / DoS (ApacheBench)</w:t>
+            </w:r>
+          </w:p>
+        </w:tc>
+        <w:tc>
+          <w:tcPr>
+            <w:tcW w:type="dxa" w:w="4680"/>
+          </w:tcPr>
+          <w:p>
+            <w:r>
+              <w:t>Límite de peticiones (rate-limiting) en NGINX</w:t>
+            </w:r>
+          </w:p>
+        </w:tc>
+      </w:tr>
+      <w:tr>
+        <w:tc>
+          <w:tcPr>
+            <w:tcW w:type="dxa" w:w="4680"/>
+          </w:tcPr>
+          <w:p>
+            <w:r>
+              <w:t>Fuerza bruta (Hydra)</w:t>
+            </w:r>
+          </w:p>
+        </w:tc>
+        <w:tc>
+          <w:tcPr>
+            <w:tcW w:type="dxa" w:w="4680"/>
+          </w:tcPr>
+          <w:p>
+            <w:r>
+              <w:t>Límite de intentos en el firewall (iptables) + Port Knocking</w:t>
+            </w:r>
+          </w:p>
+        </w:tc>
+      </w:tr>
+      <w:tr>
+        <w:tc>
+          <w:tcPr>
+            <w:tcW w:type="dxa" w:w="4680"/>
+          </w:tcPr>
+          <w:p>
+            <w:r>
+              <w:t>Escaneo web (OWASP ZAP)</w:t>
+            </w:r>
+          </w:p>
+        </w:tc>
+        <w:tc>
+          <w:tcPr>
+            <w:tcW w:type="dxa" w:w="4680"/>
+          </w:tcPr>
+          <w:p>
+            <w:r>
+              <w:t>Cabeceras de seguridad, HTTPS y validación de entrada en la app</w:t>
+            </w:r>
+          </w:p>
+        </w:tc>
+      </w:tr>
+    </w:tbl>
+    <w:p>
+      <w:r>
+        <w:br w:type="page"/>
+      </w:r>
+    </w:p>
+    <w:p>
+      <w:pPr>
+        <w:pStyle w:val="Heading1"/>
+      </w:pPr>
+      <w:r>
+        <w:rPr>
+          <w:color w:val="193A2B"/>
+        </w:rPr>
+        <w:t>8. II Parte — Red LAN inalámbrica (pendiente)</w:t>
+      </w:r>
+    </w:p>
+    <w:p>
+      <w:pPr>
+        <w:spacing w:after="120"/>
+      </w:pPr>
+      <w:r>
+        <w:rPr>
+          <w:b w:val="0"/>
+          <w:i w:val="0"/>
+          <w:sz w:val="22"/>
+        </w:rPr>
+        <w:t>Queda por desarrollar en Packet Tracer: la red LAN inalámbrica con SSID EXAMEN PARCIAL2, rango de IP 172.20.10.100–199 y DHCP, el cuadro de direcciones IP de los equipos y el diagrama de red.</w:t>
+      </w:r>
+    </w:p>
+    <w:p>
+      <w:pPr>
+        <w:pStyle w:val="Heading1"/>
+      </w:pPr>
+      <w:r>
+        <w:rPr>
+          <w:color w:val="193A2B"/>
+        </w:rPr>
+        <w:t>9. Conclusión</w:t>
+      </w:r>
+    </w:p>
+    <w:p>
+      <w:pPr>
+        <w:spacing w:after="120"/>
+      </w:pPr>
+      <w:r>
+        <w:rPr>
+          <w:b w:val="0"/>
+          <w:i w:val="0"/>
+          <w:sz w:val="22"/>
+        </w:rPr>
+        <w:t>Se desarrolló y desplegó el prototipo funcional de CHINOS CAFÉ S.A. con las tres secciones solicitadas (Fábrica, Pedidos y Pagos), control de errores, confirmación por correo en JSON y replicación de datos entre la PC y la máquina virtual. El servidor se publicó de forma segura con NGINX, HTTPS y acceso protegido por Port Knocking (I Parte). En la III Parte se montó un laboratorio aislado con Kali Linux y se ejecutaron y mitigaron ataques de escaneo, fuerza bruta, estrés y análisis de seguridad web, cumpliendo los requisitos de ambas partes.</w:t>
       </w:r>
     </w:p>
     <w:sectPr>

</xml_diff>

<commit_message>
Completar la Parte II (Packet Tracer) y reordenar el documento (I, II, III)
- Parte II: topología, cuadro de IP, DHCP, DNS y Wi-Fi (SSID EXAMEN PARCIAL2)
- Parte III movida a la sección 8 con la evidencia real del laboratorio
- Portada y conclusión actualizadas para cubrir las tres partes

Co-Authored-By: Claude Opus 4.8 <noreply@anthropic.com>
</commit_message>
<xml_diff>
--- a/Examen_Parcial2_ChinosCafe.docx
+++ b/Examen_Parcial2_ChinosCafe.docx
@@ -73,7 +73,7 @@
           <w:i/>
           <w:sz w:val="26"/>
         </w:rPr>
-        <w:t>Caso de Estudio: CHINOS CAFÉ S.A. — Prototipo Web (Parte I)</w:t>
+        <w:t>Caso de Estudio: CHINOS CAFÉ S.A. — Partes I, II y III</w:t>
       </w:r>
     </w:p>
     <w:p>
@@ -1284,7 +1284,365 @@
         <w:rPr>
           <w:color w:val="193A2B"/>
         </w:rPr>
-        <w:t>7. III Parte — Simulación de Ataque / Mitigación</w:t>
+        <w:t>7. II Parte — Red LAN inalámbrica (Packet Tracer)</w:t>
+      </w:r>
+    </w:p>
+    <w:p>
+      <w:pPr>
+        <w:spacing w:after="120"/>
+      </w:pPr>
+      <w:r>
+        <w:rPr>
+          <w:b w:val="0"/>
+          <w:i w:val="0"/>
+          <w:sz w:val="22"/>
+        </w:rPr>
+        <w:t>La II Parte se simuló en Cisco Packet Tracer (archivo ChinosCafe_ParteII_Profesional.pkt). Representa la red de la empresa con dos sedes conectadas por un router: la casa matriz (Chiriquí) y la sucursal de Veraguas. Cada sede tiene su servidor y los clientes se conectan de forma inalámbrica por Wi‑Fi, recibiendo su dirección IP automáticamente por DHCP.</w:t>
+      </w:r>
+    </w:p>
+    <w:p>
+      <w:pPr>
+        <w:pStyle w:val="Heading2"/>
+      </w:pPr>
+      <w:r>
+        <w:rPr>
+          <w:color w:val="193A2B"/>
+        </w:rPr>
+        <w:t>7.1 Topología de la red</w:t>
+      </w:r>
+    </w:p>
+    <w:p>
+      <w:pPr>
+        <w:spacing w:after="120"/>
+      </w:pPr>
+      <w:r>
+        <w:rPr>
+          <w:b w:val="0"/>
+          <w:i w:val="0"/>
+          <w:sz w:val="22"/>
+        </w:rPr>
+        <w:t>El router central (R1‑GATEWAY) hace de puerta de enlace y servidor DHCP de la red 172.20.10.0/24. De él cuelgan el punto de acceso inalámbrico (SSID EXAMEN PARCIAL2), el servidor web y DNS de Chiriquí, y el servidor web de la sucursal de Veraguas. Los equipos clientes (laptops y teléfonos) se asocian al Wi‑Fi y obtienen IP del rango DHCP.</w:t>
+      </w:r>
+    </w:p>
+    <w:p>
+      <w:pPr>
+        <w:pStyle w:val="Heading2"/>
+      </w:pPr>
+      <w:r>
+        <w:rPr>
+          <w:color w:val="193A2B"/>
+        </w:rPr>
+        <w:t>7.2 Cuadro de direcciones IP</w:t>
+      </w:r>
+    </w:p>
+    <w:tbl>
+      <w:tblPr>
+        <w:tblStyle w:val="LightGrid-Accent1"/>
+        <w:tblW w:type="auto" w:w="0"/>
+        <w:jc w:val="center"/>
+        <w:tblLook w:firstColumn="1" w:firstRow="1" w:lastColumn="0" w:lastRow="0" w:noHBand="0" w:noVBand="1" w:val="04A0"/>
+      </w:tblPr>
+      <w:tblGrid>
+        <w:gridCol w:w="3120"/>
+        <w:gridCol w:w="3120"/>
+        <w:gridCol w:w="3120"/>
+      </w:tblGrid>
+      <w:tr>
+        <w:tc>
+          <w:tcPr>
+            <w:tcW w:type="dxa" w:w="3120"/>
+          </w:tcPr>
+          <w:p>
+            <w:r>
+              <w:rPr>
+                <w:b/>
+              </w:rPr>
+              <w:t>Equipo</w:t>
+            </w:r>
+          </w:p>
+        </w:tc>
+        <w:tc>
+          <w:tcPr>
+            <w:tcW w:type="dxa" w:w="3120"/>
+          </w:tcPr>
+          <w:p>
+            <w:r>
+              <w:rPr>
+                <w:b/>
+              </w:rPr>
+              <w:t>Dirección IP</w:t>
+            </w:r>
+          </w:p>
+        </w:tc>
+        <w:tc>
+          <w:tcPr>
+            <w:tcW w:type="dxa" w:w="3120"/>
+          </w:tcPr>
+          <w:p>
+            <w:r>
+              <w:rPr>
+                <w:b/>
+              </w:rPr>
+              <w:t>Función</w:t>
+            </w:r>
+          </w:p>
+        </w:tc>
+      </w:tr>
+      <w:tr>
+        <w:tc>
+          <w:tcPr>
+            <w:tcW w:type="dxa" w:w="3120"/>
+          </w:tcPr>
+          <w:p>
+            <w:r>
+              <w:t>R1‑GATEWAY</w:t>
+            </w:r>
+          </w:p>
+        </w:tc>
+        <w:tc>
+          <w:tcPr>
+            <w:tcW w:type="dxa" w:w="3120"/>
+          </w:tcPr>
+          <w:p>
+            <w:r>
+              <w:t>172.20.10.1</w:t>
+            </w:r>
+          </w:p>
+        </w:tc>
+        <w:tc>
+          <w:tcPr>
+            <w:tcW w:type="dxa" w:w="3120"/>
+          </w:tcPr>
+          <w:p>
+            <w:r>
+              <w:t>Router / puerta de enlace y servidor DHCP</w:t>
+            </w:r>
+          </w:p>
+        </w:tc>
+      </w:tr>
+      <w:tr>
+        <w:tc>
+          <w:tcPr>
+            <w:tcW w:type="dxa" w:w="3120"/>
+          </w:tcPr>
+          <w:p>
+            <w:r>
+              <w:t>SRV‑CH‑WEB‑DNS</w:t>
+            </w:r>
+          </w:p>
+        </w:tc>
+        <w:tc>
+          <w:tcPr>
+            <w:tcW w:type="dxa" w:w="3120"/>
+          </w:tcPr>
+          <w:p>
+            <w:r>
+              <w:t>172.20.10.10</w:t>
+            </w:r>
+          </w:p>
+        </w:tc>
+        <w:tc>
+          <w:tcPr>
+            <w:tcW w:type="dxa" w:w="3120"/>
+          </w:tcPr>
+          <w:p>
+            <w:r>
+              <w:t>Servidor web y DNS (sede Chiriquí)</w:t>
+            </w:r>
+          </w:p>
+        </w:tc>
+      </w:tr>
+      <w:tr>
+        <w:tc>
+          <w:tcPr>
+            <w:tcW w:type="dxa" w:w="3120"/>
+          </w:tcPr>
+          <w:p>
+            <w:r>
+              <w:t>SRV‑VE‑WEB</w:t>
+            </w:r>
+          </w:p>
+        </w:tc>
+        <w:tc>
+          <w:tcPr>
+            <w:tcW w:type="dxa" w:w="3120"/>
+          </w:tcPr>
+          <w:p>
+            <w:r>
+              <w:t>172.20.10.11</w:t>
+            </w:r>
+          </w:p>
+        </w:tc>
+        <w:tc>
+          <w:tcPr>
+            <w:tcW w:type="dxa" w:w="3120"/>
+          </w:tcPr>
+          <w:p>
+            <w:r>
+              <w:t>Servidor web (sucursal Veraguas)</w:t>
+            </w:r>
+          </w:p>
+        </w:tc>
+      </w:tr>
+      <w:tr>
+        <w:tc>
+          <w:tcPr>
+            <w:tcW w:type="dxa" w:w="3120"/>
+          </w:tcPr>
+          <w:p>
+            <w:r>
+              <w:t>Punto de acceso Wi‑Fi</w:t>
+            </w:r>
+          </w:p>
+        </w:tc>
+        <w:tc>
+          <w:tcPr>
+            <w:tcW w:type="dxa" w:w="3120"/>
+          </w:tcPr>
+          <w:p>
+            <w:r>
+              <w:t>SSID: EXAMEN PARCIAL2</w:t>
+            </w:r>
+          </w:p>
+        </w:tc>
+        <w:tc>
+          <w:tcPr>
+            <w:tcW w:type="dxa" w:w="3120"/>
+          </w:tcPr>
+          <w:p>
+            <w:r>
+              <w:t>Acceso inalámbrico de los clientes</w:t>
+            </w:r>
+          </w:p>
+        </w:tc>
+      </w:tr>
+      <w:tr>
+        <w:tc>
+          <w:tcPr>
+            <w:tcW w:type="dxa" w:w="3120"/>
+          </w:tcPr>
+          <w:p>
+            <w:r>
+              <w:t>Clientes (DHCP)</w:t>
+            </w:r>
+          </w:p>
+        </w:tc>
+        <w:tc>
+          <w:tcPr>
+            <w:tcW w:type="dxa" w:w="3120"/>
+          </w:tcPr>
+          <w:p>
+            <w:r>
+              <w:t>172.20.10.100 – 172.20.10.199</w:t>
+            </w:r>
+          </w:p>
+        </w:tc>
+        <w:tc>
+          <w:tcPr>
+            <w:tcW w:type="dxa" w:w="3120"/>
+          </w:tcPr>
+          <w:p>
+            <w:r>
+              <w:t>Laptops y teléfonos por Wi‑Fi</w:t>
+            </w:r>
+          </w:p>
+        </w:tc>
+      </w:tr>
+    </w:tbl>
+    <w:p>
+      <w:pPr>
+        <w:pStyle w:val="Heading2"/>
+      </w:pPr>
+      <w:r>
+        <w:rPr>
+          <w:color w:val="193A2B"/>
+        </w:rPr>
+        <w:t>7.3 DHCP, DNS y acceso inalámbrico</w:t>
+      </w:r>
+    </w:p>
+    <w:p>
+      <w:pPr>
+        <w:pStyle w:val="ListBullet"/>
+      </w:pPr>
+      <w:r>
+        <w:rPr>
+          <w:b/>
+        </w:rPr>
+        <w:t xml:space="preserve">DHCP: </w:t>
+      </w:r>
+      <w:r>
+        <w:t>el router entrega automáticamente IP, máscara (255.255.255.0), puerta de enlace (172.20.10.1) y DNS a los clientes, en el rango .100–.199.</w:t>
+      </w:r>
+    </w:p>
+    <w:p>
+      <w:pPr>
+        <w:pStyle w:val="ListBullet"/>
+      </w:pPr>
+      <w:r>
+        <w:rPr>
+          <w:b/>
+        </w:rPr>
+        <w:t xml:space="preserve">DNS: </w:t>
+      </w:r>
+      <w:r>
+        <w:t>el servidor de Chiriquí resuelve los nombres chinos.test (sede matriz) y veraguas.chinos.test (sucursal), de modo que los clientes abren el sitio por nombre y no por IP.</w:t>
+      </w:r>
+    </w:p>
+    <w:p>
+      <w:pPr>
+        <w:pStyle w:val="ListBullet"/>
+      </w:pPr>
+      <w:r>
+        <w:rPr>
+          <w:b/>
+        </w:rPr>
+        <w:t xml:space="preserve">Wi‑Fi: </w:t>
+      </w:r>
+      <w:r>
+        <w:t>los equipos se conectan al SSID EXAMEN PARCIAL2 y, una vez asociados, obtienen conectividad y navegan hacia los servidores web.</w:t>
+      </w:r>
+    </w:p>
+    <w:p>
+      <w:pPr>
+        <w:pStyle w:val="ListBullet"/>
+      </w:pPr>
+      <w:r>
+        <w:rPr>
+          <w:b/>
+        </w:rPr>
+        <w:t xml:space="preserve">Validación: </w:t>
+      </w:r>
+      <w:r>
+        <w:t>desde un cliente se comprueba la conexión con ping a la puerta de enlace y a los servidores, y abriendo las páginas web por su nombre DNS.</w:t>
+      </w:r>
+    </w:p>
+    <w:p>
+      <w:pPr>
+        <w:spacing w:after="120"/>
+      </w:pPr>
+      <w:r>
+        <w:rPr>
+          <w:b w:val="0"/>
+          <w:i/>
+          <w:sz w:val="22"/>
+        </w:rPr>
+        <w:t>El diagrama de la topología y las capturas de la configuración (DHCP, DNS, SSID y pruebas de conexión de los clientes) se encuentran en el archivo de Packet Tracer ChinosCafe_ParteII_Profesional.pkt que acompaña a esta entrega.</w:t>
+      </w:r>
+    </w:p>
+    <w:p>
+      <w:r>
+        <w:br w:type="page"/>
+      </w:r>
+    </w:p>
+    <w:p>
+      <w:pPr>
+        <w:pStyle w:val="Heading1"/>
+      </w:pPr>
+      <w:r>
+        <w:rPr>
+          <w:color w:val="193A2B"/>
+        </w:rPr>
+        <w:t>8. III Parte — Simulación de Ataque / Mitigación</w:t>
       </w:r>
     </w:p>
     <w:p>
@@ -1403,7 +1761,7 @@
         <w:rPr>
           <w:color w:val="193A2B"/>
         </w:rPr>
-        <w:t>7.1 Red aislada y servidor NGINX (IP fija + HTTPS)</w:t>
+        <w:t>8.1 Red aislada y servidor NGINX (IP fija + HTTPS)</w:t>
       </w:r>
     </w:p>
     <w:p>
@@ -1480,7 +1838,7 @@
         <w:rPr>
           <w:color w:val="193A2B"/>
         </w:rPr>
-        <w:t>7.2 Escaneo de puertos — Nmap</w:t>
+        <w:t>8.2 Escaneo de puertos — Nmap</w:t>
       </w:r>
     </w:p>
     <w:p>
@@ -1557,7 +1915,7 @@
         <w:rPr>
           <w:color w:val="193A2B"/>
         </w:rPr>
-        <w:t>7.3 Fuerza bruta — Hydra (FTP)</w:t>
+        <w:t>8.3 Fuerza bruta — Hydra (FTP)</w:t>
       </w:r>
     </w:p>
     <w:p>
@@ -1634,7 +1992,7 @@
         <w:rPr>
           <w:color w:val="193A2B"/>
         </w:rPr>
-        <w:t>7.4 Prueba de estrés / DoS — ApacheBench</w:t>
+        <w:t>8.4 Prueba de estrés / DoS — ApacheBench</w:t>
       </w:r>
     </w:p>
     <w:p>
@@ -1711,7 +2069,7 @@
         <w:rPr>
           <w:color w:val="193A2B"/>
         </w:rPr>
-        <w:t>7.5 Escaneo de seguridad web — OWASP ZAP</w:t>
+        <w:t>8.5 Escaneo de seguridad web — OWASP ZAP</w:t>
       </w:r>
     </w:p>
     <w:p>
@@ -1788,7 +2146,7 @@
         <w:rPr>
           <w:color w:val="193A2B"/>
         </w:rPr>
-        <w:t>7.6 Captura de tráfico — Wireshark</w:t>
+        <w:t>8.6 Captura de tráfico — Wireshark</w:t>
       </w:r>
     </w:p>
     <w:p>
@@ -1865,7 +2223,7 @@
         <w:rPr>
           <w:color w:val="193A2B"/>
         </w:rPr>
-        <w:t>7.7 Resumen de mitigaciones aplicadas</w:t>
+        <w:t>8.7 Resumen de mitigaciones aplicadas</w:t>
       </w:r>
     </w:p>
     <w:tbl>
@@ -2018,35 +2376,6 @@
       </w:tr>
     </w:tbl>
     <w:p>
-      <w:r>
-        <w:br w:type="page"/>
-      </w:r>
-    </w:p>
-    <w:p>
-      <w:pPr>
-        <w:pStyle w:val="Heading1"/>
-      </w:pPr>
-      <w:r>
-        <w:rPr>
-          <w:color w:val="193A2B"/>
-        </w:rPr>
-        <w:t>8. II Parte — Red LAN inalámbrica (pendiente)</w:t>
-      </w:r>
-    </w:p>
-    <w:p>
-      <w:pPr>
-        <w:spacing w:after="120"/>
-      </w:pPr>
-      <w:r>
-        <w:rPr>
-          <w:b w:val="0"/>
-          <w:i w:val="0"/>
-          <w:sz w:val="22"/>
-        </w:rPr>
-        <w:t>Queda por desarrollar en Packet Tracer: la red LAN inalámbrica con SSID EXAMEN PARCIAL2, rango de IP 172.20.10.100–199 y DHCP, el cuadro de direcciones IP de los equipos y el diagrama de red.</w:t>
-      </w:r>
-    </w:p>
-    <w:p>
       <w:pPr>
         <w:pStyle w:val="Heading1"/>
       </w:pPr>
@@ -2067,7 +2396,7 @@
           <w:i w:val="0"/>
           <w:sz w:val="22"/>
         </w:rPr>
-        <w:t>Se desarrolló y desplegó el prototipo funcional de CHINOS CAFÉ S.A. con las tres secciones solicitadas (Fábrica, Pedidos y Pagos), control de errores, confirmación por correo en JSON y replicación de datos entre la PC y la máquina virtual. El servidor se publicó de forma segura con NGINX, HTTPS y acceso protegido por Port Knocking (I Parte). En la III Parte se montó un laboratorio aislado con Kali Linux y se ejecutaron y mitigaron ataques de escaneo, fuerza bruta, estrés y análisis de seguridad web, cumpliendo los requisitos de ambas partes.</w:t>
+        <w:t>Se desarrolló y desplegó el prototipo funcional de CHINOS CAFÉ S.A. con las tres secciones solicitadas (Fábrica, Pedidos y Pagos), control de errores, confirmación por correo en JSON y replicación de datos entre la PC y la máquina virtual. El servidor se publicó de forma segura con NGINX, HTTPS y acceso protegido por Port Knocking (I Parte). En la II Parte se simuló en Packet Tracer la red LAN inalámbrica con DHCP, DNS y Wi‑Fi (SSID EXAMEN PARCIAL2). En la III Parte se montó un laboratorio aislado con Kali Linux y se ejecutaron y mitigaron ataques de escaneo, fuerza bruta, estrés y análisis de seguridad web, cumpliendo los requisitos de las tres partes del examen.</w:t>
       </w:r>
     </w:p>
     <w:sectPr>

</xml_diff>